<commit_message>
fix: complete CRUD relation handling and Postman report
</commit_message>
<xml_diff>
--- a/livrables/AutoLoc_Controllers_et_Tests_Postman.docx
+++ b/livrables/AutoLoc_Controllers_et_Tests_Postman.docx
@@ -16,7 +16,7 @@
         <w:jc w:val="center"/>
       </w:pPr>
       <w:r>
-        <w:t>Ce document présente les neuf contrôleurs REST et la collection Postman CRUD associée. Chaque contrôleur délègue les opérations à la couche Service.</w:t>
+        <w:t>Ce document présente les neuf contrôleurs REST et les résultats réels de la collection CRUD Postman. Chaque contrôleur délègue les opérations à la couche Service.</w:t>
       </w:r>
     </w:p>
     <w:p>
@@ -551,13 +551,36 @@
       </w:r>
     </w:p>
     <w:p>
+      <w:r>
+        <w:t>Les résultats des pages suivantes proviennent de cette collection et couvrent les opérations POST, GET, PUT et DELETE pour Agence, Client, Contrat, Employé, Équipement, Maintenance, Paiement, Réservation et Véhicule.</w:t>
+      </w:r>
+    </w:p>
+    <w:p>
+      <w:r>
+        <w:br w:type="page"/>
+      </w:r>
+    </w:p>
+    <w:p>
+      <w:pPr>
+        <w:pStyle w:val="Title"/>
+      </w:pPr>
+      <w:r>
+        <w:t>Résultats tests Postman 1</w:t>
+      </w:r>
+    </w:p>
+    <w:p>
+      <w:r>
+        <w:t>Exécution réelle de la collection Postman avec Newman. Chaque ligne indique la requête envoyée et la réponse HTTP obtenue.</w:t>
+      </w:r>
+    </w:p>
+    <w:p>
       <w:pPr>
         <w:jc w:val="center"/>
       </w:pPr>
       <w:r>
         <w:drawing>
           <wp:inline xmlns:a="http://schemas.openxmlformats.org/drawingml/2006/main" xmlns:pic="http://schemas.openxmlformats.org/drawingml/2006/picture">
-            <wp:extent cx="9418320" cy="121041109"/>
+            <wp:extent cx="9418320" cy="3484778"/>
             <wp:docPr id="10" name="Picture 10"/>
             <wp:cNvGraphicFramePr>
               <a:graphicFrameLocks noChangeAspect="1"/>
@@ -566,7 +589,7 @@
               <a:graphicData uri="http://schemas.openxmlformats.org/drawingml/2006/picture">
                 <pic:pic>
                   <pic:nvPicPr>
-                    <pic:cNvPr id="0" name="PostmanCollection.png"/>
+                    <pic:cNvPr id="0" name="PostmanResultats1.png"/>
                     <pic:cNvPicPr/>
                   </pic:nvPicPr>
                   <pic:blipFill>
@@ -578,7 +601,178 @@
                   <pic:spPr>
                     <a:xfrm>
                       <a:off x="0" y="0"/>
-                      <a:ext cx="9418320" cy="121041109"/>
+                      <a:ext cx="9418320" cy="3484778"/>
+                    </a:xfrm>
+                    <a:prstGeom prst="rect"/>
+                  </pic:spPr>
+                </pic:pic>
+              </a:graphicData>
+            </a:graphic>
+          </wp:inline>
+        </w:drawing>
+      </w:r>
+    </w:p>
+    <w:p>
+      <w:r>
+        <w:br w:type="page"/>
+      </w:r>
+    </w:p>
+    <w:p>
+      <w:pPr>
+        <w:pStyle w:val="Title"/>
+      </w:pPr>
+      <w:r>
+        <w:t>Résultats tests Postman 2</w:t>
+      </w:r>
+    </w:p>
+    <w:p>
+      <w:r>
+        <w:t>Exécution réelle de la collection Postman avec Newman. Chaque ligne indique la requête envoyée et la réponse HTTP obtenue.</w:t>
+      </w:r>
+    </w:p>
+    <w:p>
+      <w:pPr>
+        <w:jc w:val="center"/>
+      </w:pPr>
+      <w:r>
+        <w:drawing>
+          <wp:inline xmlns:a="http://schemas.openxmlformats.org/drawingml/2006/main" xmlns:pic="http://schemas.openxmlformats.org/drawingml/2006/picture">
+            <wp:extent cx="9418320" cy="3484778"/>
+            <wp:docPr id="11" name="Picture 11"/>
+            <wp:cNvGraphicFramePr>
+              <a:graphicFrameLocks noChangeAspect="1"/>
+            </wp:cNvGraphicFramePr>
+            <a:graphic>
+              <a:graphicData uri="http://schemas.openxmlformats.org/drawingml/2006/picture">
+                <pic:pic>
+                  <pic:nvPicPr>
+                    <pic:cNvPr id="0" name="PostmanResultats2.png"/>
+                    <pic:cNvPicPr/>
+                  </pic:nvPicPr>
+                  <pic:blipFill>
+                    <a:blip r:embed="rId19"/>
+                    <a:stretch>
+                      <a:fillRect/>
+                    </a:stretch>
+                  </pic:blipFill>
+                  <pic:spPr>
+                    <a:xfrm>
+                      <a:off x="0" y="0"/>
+                      <a:ext cx="9418320" cy="3484778"/>
+                    </a:xfrm>
+                    <a:prstGeom prst="rect"/>
+                  </pic:spPr>
+                </pic:pic>
+              </a:graphicData>
+            </a:graphic>
+          </wp:inline>
+        </w:drawing>
+      </w:r>
+    </w:p>
+    <w:p>
+      <w:r>
+        <w:br w:type="page"/>
+      </w:r>
+    </w:p>
+    <w:p>
+      <w:pPr>
+        <w:pStyle w:val="Title"/>
+      </w:pPr>
+      <w:r>
+        <w:t>Résultats tests Postman 3</w:t>
+      </w:r>
+    </w:p>
+    <w:p>
+      <w:r>
+        <w:t>Exécution réelle de la collection Postman avec Newman. Chaque ligne indique la requête envoyée et la réponse HTTP obtenue.</w:t>
+      </w:r>
+    </w:p>
+    <w:p>
+      <w:pPr>
+        <w:jc w:val="center"/>
+      </w:pPr>
+      <w:r>
+        <w:drawing>
+          <wp:inline xmlns:a="http://schemas.openxmlformats.org/drawingml/2006/main" xmlns:pic="http://schemas.openxmlformats.org/drawingml/2006/picture">
+            <wp:extent cx="9418320" cy="3484778"/>
+            <wp:docPr id="12" name="Picture 12"/>
+            <wp:cNvGraphicFramePr>
+              <a:graphicFrameLocks noChangeAspect="1"/>
+            </wp:cNvGraphicFramePr>
+            <a:graphic>
+              <a:graphicData uri="http://schemas.openxmlformats.org/drawingml/2006/picture">
+                <pic:pic>
+                  <pic:nvPicPr>
+                    <pic:cNvPr id="0" name="PostmanResultats3.png"/>
+                    <pic:cNvPicPr/>
+                  </pic:nvPicPr>
+                  <pic:blipFill>
+                    <a:blip r:embed="rId20"/>
+                    <a:stretch>
+                      <a:fillRect/>
+                    </a:stretch>
+                  </pic:blipFill>
+                  <pic:spPr>
+                    <a:xfrm>
+                      <a:off x="0" y="0"/>
+                      <a:ext cx="9418320" cy="3484778"/>
+                    </a:xfrm>
+                    <a:prstGeom prst="rect"/>
+                  </pic:spPr>
+                </pic:pic>
+              </a:graphicData>
+            </a:graphic>
+          </wp:inline>
+        </w:drawing>
+      </w:r>
+    </w:p>
+    <w:p>
+      <w:r>
+        <w:br w:type="page"/>
+      </w:r>
+    </w:p>
+    <w:p>
+      <w:pPr>
+        <w:pStyle w:val="Title"/>
+      </w:pPr>
+      <w:r>
+        <w:t>Bilan des tests Postman</w:t>
+      </w:r>
+    </w:p>
+    <w:p>
+      <w:r>
+        <w:t>Bilan de l’exécution finale : toutes les requêtes et toutes les assertions ont réussi.</w:t>
+      </w:r>
+    </w:p>
+    <w:p>
+      <w:pPr>
+        <w:jc w:val="center"/>
+      </w:pPr>
+      <w:r>
+        <w:drawing>
+          <wp:inline xmlns:a="http://schemas.openxmlformats.org/drawingml/2006/main" xmlns:pic="http://schemas.openxmlformats.org/drawingml/2006/picture">
+            <wp:extent cx="9418320" cy="1343680"/>
+            <wp:docPr id="13" name="Picture 13"/>
+            <wp:cNvGraphicFramePr>
+              <a:graphicFrameLocks noChangeAspect="1"/>
+            </wp:cNvGraphicFramePr>
+            <a:graphic>
+              <a:graphicData uri="http://schemas.openxmlformats.org/drawingml/2006/picture">
+                <pic:pic>
+                  <pic:nvPicPr>
+                    <pic:cNvPr id="0" name="PostmanBilan.png"/>
+                    <pic:cNvPicPr/>
+                  </pic:nvPicPr>
+                  <pic:blipFill>
+                    <a:blip r:embed="rId21"/>
+                    <a:stretch>
+                      <a:fillRect/>
+                    </a:stretch>
+                  </pic:blipFill>
+                  <pic:spPr>
+                    <a:xfrm>
+                      <a:off x="0" y="0"/>
+                      <a:ext cx="9418320" cy="1343680"/>
                     </a:xfrm>
                     <a:prstGeom prst="rect"/>
                   </pic:spPr>

</xml_diff>